<commit_message>
Feat: Edited the file
</commit_message>
<xml_diff>
--- a/tools/Netcat_NC/File Transfer And Communication_Project/FileTransfer_Communication_Project.docx
+++ b/tools/Netcat_NC/File Transfer And Communication_Project/FileTransfer_Communication_Project.docx
@@ -27,6 +27,7 @@
         <w:spacing w:before="260" w:after="100"/>
         <w:jc w:val="center"/>
       </w:pPr>
+      <w:proofErr w:type="spellStart"/>
       <w:r>
         <w:rPr>
           <w:b/>
@@ -35,7 +36,18 @@
           <w:sz w:val="60"/>
           <w:szCs w:val="60"/>
         </w:rPr>
-        <w:t>Netcat (nc)</w:t>
+        <w:t>Netcat</w:t>
+      </w:r>
+      <w:proofErr w:type="spellEnd"/>
+      <w:r>
+        <w:rPr>
+          <w:b/>
+          <w:bCs/>
+          <w:color w:val="000000"/>
+          <w:sz w:val="60"/>
+          <w:szCs w:val="60"/>
+        </w:rPr>
+        <w:t xml:space="preserve"> (nc)</w:t>
       </w:r>
     </w:p>
     <w:p>
@@ -67,7 +79,29 @@
           <w:sz w:val="21"/>
           <w:szCs w:val="21"/>
         </w:rPr>
-        <w:t>Hands-on lab practicals using Netcat between a Kali Linux attacker VM and a Metasploitable2 target VM, run over a private VirtualBox host-only network.</w:t>
+        <w:t xml:space="preserve">Hands-on lab practicals using </w:t>
+      </w:r>
+      <w:proofErr w:type="spellStart"/>
+      <w:r>
+        <w:rPr>
+          <w:i/>
+          <w:iCs/>
+          <w:color w:val="4D4D4D"/>
+          <w:sz w:val="21"/>
+          <w:szCs w:val="21"/>
+        </w:rPr>
+        <w:t>Netcat</w:t>
+      </w:r>
+      <w:proofErr w:type="spellEnd"/>
+      <w:r>
+        <w:rPr>
+          <w:i/>
+          <w:iCs/>
+          <w:color w:val="4D4D4D"/>
+          <w:sz w:val="21"/>
+          <w:szCs w:val="21"/>
+        </w:rPr>
+        <w:t xml:space="preserve"> between a Kali Linux attacker VM and a Metasploitable2 target VM, run over a private VirtualBox host-only network.</w:t>
       </w:r>
     </w:p>
     <w:p>
@@ -128,6 +162,12 @@
     </w:p>
     <w:sdt>
       <w:sdtPr>
+        <w:rPr>
+          <w:rFonts w:ascii="Calibri" w:eastAsia="Calibri" w:hAnsi="Calibri" w:cs="Calibri"/>
+          <w:color w:val="auto"/>
+          <w:sz w:val="20"/>
+          <w:szCs w:val="20"/>
+        </w:rPr>
         <w:id w:val="1020588121"/>
         <w:docPartObj>
           <w:docPartGallery w:val="Table of Contents"/>
@@ -136,13 +176,9 @@
       </w:sdtPr>
       <w:sdtEndPr>
         <w:rPr>
-          <w:rFonts w:ascii="Calibri" w:eastAsia="Calibri" w:hAnsi="Calibri" w:cs="Calibri"/>
           <w:b/>
           <w:bCs/>
           <w:noProof/>
-          <w:color w:val="auto"/>
-          <w:sz w:val="20"/>
-          <w:szCs w:val="20"/>
         </w:rPr>
       </w:sdtEndPr>
       <w:sdtContent>
@@ -654,13 +690,23 @@
       <w:pPr>
         <w:spacing w:after="160" w:line="300" w:lineRule="auto"/>
       </w:pPr>
-      <w:r>
-        <w:rPr>
-          <w:color w:val="262626"/>
-          <w:sz w:val="21"/>
-          <w:szCs w:val="21"/>
-        </w:rPr>
-        <w:t>Netcat (nc) is a lightweight command-line networking utility often described as the "TCP/IP Swiss Army knife." It reads and writes data across network connections using TCP or UDP, which makes it useful for banner grabbing, port scanning, file transfer, and building simple client/server communication channels.</w:t>
+      <w:proofErr w:type="spellStart"/>
+      <w:r>
+        <w:rPr>
+          <w:color w:val="262626"/>
+          <w:sz w:val="21"/>
+          <w:szCs w:val="21"/>
+        </w:rPr>
+        <w:t>Netcat</w:t>
+      </w:r>
+      <w:proofErr w:type="spellEnd"/>
+      <w:r>
+        <w:rPr>
+          <w:color w:val="262626"/>
+          <w:sz w:val="21"/>
+          <w:szCs w:val="21"/>
+        </w:rPr>
+        <w:t xml:space="preserve"> (nc) is a lightweight command-line networking utility often described as the "TCP/IP Swiss Army knife." It reads and writes data across network connections using TCP or UDP, which makes it useful for banner grabbing, port scanning, file transfer, and building simple client/server communication channels.</w:t>
       </w:r>
     </w:p>
     <w:p>
@@ -673,7 +719,43 @@
           <w:sz w:val="21"/>
           <w:szCs w:val="21"/>
         </w:rPr>
-        <w:t>This module documents two beginner practicals carried out across two virtual machines on the same VirtualBox host-only network: a Metasploitable2 VM acting as one endpoint (192.168.56.102) and a Kali Linux VM acting as the other endpoint (192.168.56.101). The goal was to understand Netcat's listener/client model (-l to listen, and a plain nc &lt;ip&gt; &lt;port&gt; to connect) before moving on to more advanced uses such as reverse shells and port scanning in later modules.</w:t>
+        <w:t xml:space="preserve">This module documents two beginner practicals carried out across two virtual machines on the same VirtualBox host-only network: a Metasploitable2 VM acting as one endpoint (192.168.56.102) and a Kali Linux VM acting as the other endpoint (192.168.56.101). The goal was to understand </w:t>
+      </w:r>
+      <w:proofErr w:type="spellStart"/>
+      <w:r>
+        <w:rPr>
+          <w:color w:val="262626"/>
+          <w:sz w:val="21"/>
+          <w:szCs w:val="21"/>
+        </w:rPr>
+        <w:t>Netcat's</w:t>
+      </w:r>
+      <w:proofErr w:type="spellEnd"/>
+      <w:r>
+        <w:rPr>
+          <w:color w:val="262626"/>
+          <w:sz w:val="21"/>
+          <w:szCs w:val="21"/>
+        </w:rPr>
+        <w:t xml:space="preserve"> listener/client model (-l to listen, and a plain nc &lt;</w:t>
+      </w:r>
+      <w:proofErr w:type="spellStart"/>
+      <w:r>
+        <w:rPr>
+          <w:color w:val="262626"/>
+          <w:sz w:val="21"/>
+          <w:szCs w:val="21"/>
+        </w:rPr>
+        <w:t>ip</w:t>
+      </w:r>
+      <w:proofErr w:type="spellEnd"/>
+      <w:r>
+        <w:rPr>
+          <w:color w:val="262626"/>
+          <w:sz w:val="21"/>
+          <w:szCs w:val="21"/>
+        </w:rPr>
+        <w:t>&gt; &lt;port&gt; to connect) before moving on to more advanced uses such as reverse shells and port scanning in later modules.</w:t>
       </w:r>
     </w:p>
     <w:tbl>
@@ -986,13 +1068,23 @@
             <w:vAlign w:val="center"/>
           </w:tcPr>
           <w:p>
+            <w:proofErr w:type="spellStart"/>
             <w:r>
               <w:rPr>
                 <w:color w:val="262626"/>
                 <w:sz w:val="19"/>
                 <w:szCs w:val="19"/>
               </w:rPr>
-              <w:t>Netcat (nc)</w:t>
+              <w:t>Netcat</w:t>
+            </w:r>
+            <w:proofErr w:type="spellEnd"/>
+            <w:r>
+              <w:rPr>
+                <w:color w:val="262626"/>
+                <w:sz w:val="19"/>
+                <w:szCs w:val="19"/>
+              </w:rPr>
+              <w:t xml:space="preserve"> (nc)</w:t>
             </w:r>
           </w:p>
         </w:tc>
@@ -1019,21 +1111,41 @@
           <w:color w:val="000000"/>
         </w:rPr>
         <w:lastRenderedPageBreak/>
-        <w:t>1. File Transfer with Netcat</w:t>
+        <w:t xml:space="preserve">1. File Transfer with </w:t>
+      </w:r>
+      <w:proofErr w:type="spellStart"/>
+      <w:r>
+        <w:rPr>
+          <w:b/>
+          <w:bCs/>
+          <w:color w:val="000000"/>
+        </w:rPr>
+        <w:t>Netcat</w:t>
       </w:r>
       <w:bookmarkEnd w:id="1"/>
+      <w:proofErr w:type="spellEnd"/>
     </w:p>
     <w:p>
       <w:pPr>
         <w:spacing w:after="160" w:line="300" w:lineRule="auto"/>
       </w:pPr>
-      <w:r>
-        <w:rPr>
-          <w:color w:val="262626"/>
-          <w:sz w:val="21"/>
-          <w:szCs w:val="21"/>
-        </w:rPr>
-        <w:t>Netcat can move a file between two hosts with no dedicated file-transfer protocol: one side listens and redirects the incoming stream into a file, and the other side connects and feeds a file into the stream. This practical sent a text file from the Kali VM to the Metasploitable2 VM over port 4444.</w:t>
+      <w:proofErr w:type="spellStart"/>
+      <w:r>
+        <w:rPr>
+          <w:color w:val="262626"/>
+          <w:sz w:val="21"/>
+          <w:szCs w:val="21"/>
+        </w:rPr>
+        <w:t>Netcat</w:t>
+      </w:r>
+      <w:proofErr w:type="spellEnd"/>
+      <w:r>
+        <w:rPr>
+          <w:color w:val="262626"/>
+          <w:sz w:val="21"/>
+          <w:szCs w:val="21"/>
+        </w:rPr>
+        <w:t xml:space="preserve"> can move a file between two hosts with no dedicated file-transfer protocol: one side listens and redirects the incoming stream into a file, and the other side connects and feeds a file into the stream. This practical sent a text file from the Kali VM to the Metasploitable2 VM over port 4444.</w:t>
       </w:r>
     </w:p>
     <w:tbl>
@@ -1141,7 +1253,27 @@
                 <w:sz w:val="19"/>
                 <w:szCs w:val="19"/>
               </w:rPr>
-              <w:t>$ nc -lvp 4444 &gt;receiveed.txt</w:t>
+              <w:t>$ nc -</w:t>
+            </w:r>
+            <w:proofErr w:type="spellStart"/>
+            <w:r>
+              <w:rPr>
+                <w:rFonts w:ascii="Consolas" w:eastAsia="Consolas" w:hAnsi="Consolas" w:cs="Consolas"/>
+                <w:color w:val="E8E8E8"/>
+                <w:sz w:val="19"/>
+                <w:szCs w:val="19"/>
+              </w:rPr>
+              <w:t>lvp</w:t>
+            </w:r>
+            <w:proofErr w:type="spellEnd"/>
+            <w:r>
+              <w:rPr>
+                <w:rFonts w:ascii="Consolas" w:eastAsia="Consolas" w:hAnsi="Consolas" w:cs="Consolas"/>
+                <w:color w:val="E8E8E8"/>
+                <w:sz w:val="19"/>
+                <w:szCs w:val="19"/>
+              </w:rPr>
+              <w:t xml:space="preserve"> 4444 &gt;receiveed.txt</w:t>
             </w:r>
           </w:p>
           <w:p>
@@ -1208,7 +1340,61 @@
           <w:sz w:val="21"/>
           <w:szCs w:val="21"/>
         </w:rPr>
-        <w:t>The receiving side is set up first: nc -lvp 4444 tells Netcat to listen (-l), print connection details verbosely (-v), stay on port 4444 (-p 4444), and the shell redirection &gt;receiveed.txt writes anything received on that socket straight into a file instead of the screen. The sending side is a plain client connection, nc &lt;target-ip&gt; &lt;port&gt;, with &lt;send.txt redirecting the local file's contents into the socket as the payload.</w:t>
+        <w:t>The receiving side is set up first: nc -</w:t>
+      </w:r>
+      <w:proofErr w:type="spellStart"/>
+      <w:r>
+        <w:rPr>
+          <w:color w:val="262626"/>
+          <w:sz w:val="21"/>
+          <w:szCs w:val="21"/>
+        </w:rPr>
+        <w:t>lvp</w:t>
+      </w:r>
+      <w:proofErr w:type="spellEnd"/>
+      <w:r>
+        <w:rPr>
+          <w:color w:val="262626"/>
+          <w:sz w:val="21"/>
+          <w:szCs w:val="21"/>
+        </w:rPr>
+        <w:t xml:space="preserve"> 4444 tells </w:t>
+      </w:r>
+      <w:proofErr w:type="spellStart"/>
+      <w:r>
+        <w:rPr>
+          <w:color w:val="262626"/>
+          <w:sz w:val="21"/>
+          <w:szCs w:val="21"/>
+        </w:rPr>
+        <w:t>Netcat</w:t>
+      </w:r>
+      <w:proofErr w:type="spellEnd"/>
+      <w:r>
+        <w:rPr>
+          <w:color w:val="262626"/>
+          <w:sz w:val="21"/>
+          <w:szCs w:val="21"/>
+        </w:rPr>
+        <w:t xml:space="preserve"> to listen (-l), print connection details verbosely (-v), stay on port 4444 (-p 4444), and the shell redirection &gt;receiveed.txt writes anything received on that socket straight into a file instead of the screen. The sending side is a plain client connection, nc &lt;target-</w:t>
+      </w:r>
+      <w:proofErr w:type="spellStart"/>
+      <w:r>
+        <w:rPr>
+          <w:color w:val="262626"/>
+          <w:sz w:val="21"/>
+          <w:szCs w:val="21"/>
+        </w:rPr>
+        <w:t>ip</w:t>
+      </w:r>
+      <w:proofErr w:type="spellEnd"/>
+      <w:r>
+        <w:rPr>
+          <w:color w:val="262626"/>
+          <w:sz w:val="21"/>
+          <w:szCs w:val="21"/>
+        </w:rPr>
+        <w:t>&gt; &lt;port&gt;, with &lt;send.txt redirecting the local file's contents into the socket as the payload.</w:t>
       </w:r>
     </w:p>
     <w:p>
@@ -1221,7 +1407,25 @@
           <w:sz w:val="21"/>
           <w:szCs w:val="21"/>
         </w:rPr>
-        <w:t>As soon as the client connects, Netcat has no built-in concept of "end of file" for a transfer</w:t>
+        <w:t xml:space="preserve">As soon as the client connects, </w:t>
+      </w:r>
+      <w:proofErr w:type="spellStart"/>
+      <w:r>
+        <w:rPr>
+          <w:color w:val="262626"/>
+          <w:sz w:val="21"/>
+          <w:szCs w:val="21"/>
+        </w:rPr>
+        <w:t>Netcat</w:t>
+      </w:r>
+      <w:proofErr w:type="spellEnd"/>
+      <w:r>
+        <w:rPr>
+          <w:color w:val="262626"/>
+          <w:sz w:val="21"/>
+          <w:szCs w:val="21"/>
+        </w:rPr>
+        <w:t xml:space="preserve"> has no built-in concept of "end of file" for a transfer</w:t>
       </w:r>
       <w:r>
         <w:rPr>
@@ -1302,7 +1506,29 @@
           <w:sz w:val="18"/>
           <w:szCs w:val="18"/>
         </w:rPr>
-        <w:t>Figure 1 — Kali sending send.txt to the Metasploitable2 listener on port 4444; the received file is verified with dir and cat on the target.</w:t>
+        <w:t xml:space="preserve">Figure 1 — Kali sending send.txt to the Metasploitable2 listener on port 4444; the received file is verified with </w:t>
+      </w:r>
+      <w:proofErr w:type="spellStart"/>
+      <w:r>
+        <w:rPr>
+          <w:i/>
+          <w:iCs/>
+          <w:color w:val="4D4D4D"/>
+          <w:sz w:val="18"/>
+          <w:szCs w:val="18"/>
+        </w:rPr>
+        <w:t>dir</w:t>
+      </w:r>
+      <w:proofErr w:type="spellEnd"/>
+      <w:r>
+        <w:rPr>
+          <w:i/>
+          <w:iCs/>
+          <w:color w:val="4D4D4D"/>
+          <w:sz w:val="18"/>
+          <w:szCs w:val="18"/>
+        </w:rPr>
+        <w:t xml:space="preserve"> and cat on the target.</w:t>
       </w:r>
     </w:p>
     <w:tbl>
@@ -1472,7 +1698,25 @@
                 <w:sz w:val="19"/>
                 <w:szCs w:val="19"/>
               </w:rPr>
-              <w:t>nc -lvp 4444 &gt;receiveed.txt (Metasploitable2)</w:t>
+              <w:t>nc -</w:t>
+            </w:r>
+            <w:proofErr w:type="spellStart"/>
+            <w:r>
+              <w:rPr>
+                <w:color w:val="262626"/>
+                <w:sz w:val="19"/>
+                <w:szCs w:val="19"/>
+              </w:rPr>
+              <w:t>lvp</w:t>
+            </w:r>
+            <w:proofErr w:type="spellEnd"/>
+            <w:r>
+              <w:rPr>
+                <w:color w:val="262626"/>
+                <w:sz w:val="19"/>
+                <w:szCs w:val="19"/>
+              </w:rPr>
+              <w:t xml:space="preserve"> 4444 &gt;receiveed.txt (Metasploitable2)</w:t>
             </w:r>
           </w:p>
         </w:tc>
@@ -1666,13 +1910,23 @@
             <w:vAlign w:val="center"/>
           </w:tcPr>
           <w:p>
+            <w:proofErr w:type="spellStart"/>
             <w:r>
               <w:rPr>
                 <w:color w:val="262626"/>
                 <w:sz w:val="19"/>
                 <w:szCs w:val="19"/>
               </w:rPr>
-              <w:t>dir listed the new file; cat receiveed.txt confirmed its contents</w:t>
+              <w:t>dir</w:t>
+            </w:r>
+            <w:proofErr w:type="spellEnd"/>
+            <w:r>
+              <w:rPr>
+                <w:color w:val="262626"/>
+                <w:sz w:val="19"/>
+                <w:szCs w:val="19"/>
+              </w:rPr>
+              <w:t xml:space="preserve"> listed the new file; cat receiveed.txt confirmed its contents</w:t>
             </w:r>
           </w:p>
         </w:tc>
@@ -1721,19 +1975,55 @@
               <w:rPr>
                 <w:color w:val="1A1A1A"/>
               </w:rPr>
-              <w:t>I mistyped the output filename as receiveed.txt (double "e") in the listener command, and the transfer still completed without error — Netcat doesn't validate filenames, it just writes to whatever path the shell redirection gives it. I noticed the listener never terminates on its own after the file is fully received</w:t>
-            </w:r>
+              <w:t xml:space="preserve">I mistyped the output filename as receiveed.txt (double "e") in the listener command, and the transfer still completed without error — </w:t>
+            </w:r>
+            <w:proofErr w:type="spellStart"/>
             <w:r>
               <w:rPr>
                 <w:color w:val="1A1A1A"/>
               </w:rPr>
-              <w:t xml:space="preserve"> instead</w:t>
-            </w:r>
+              <w:t>Netcat</w:t>
+            </w:r>
+            <w:proofErr w:type="spellEnd"/>
             <w:r>
               <w:rPr>
                 <w:color w:val="1A1A1A"/>
               </w:rPr>
-              <w:t xml:space="preserve"> I had to confirm completion by checking the file and then close the listener with Ctrl+C.</w:t>
+              <w:t xml:space="preserve"> doesn't validate filenames, it just writes to whatever path the shell redirection gives it. I noticed the listener never terminates on its own after the file is fully received</w:t>
+            </w:r>
+            <w:r>
+              <w:rPr>
+                <w:color w:val="1A1A1A"/>
+              </w:rPr>
+              <w:t xml:space="preserve"> </w:t>
+            </w:r>
+            <w:proofErr w:type="gramStart"/>
+            <w:r>
+              <w:rPr>
+                <w:color w:val="1A1A1A"/>
+              </w:rPr>
+              <w:t>instead</w:t>
+            </w:r>
+            <w:proofErr w:type="gramEnd"/>
+            <w:r>
+              <w:rPr>
+                <w:color w:val="1A1A1A"/>
+              </w:rPr>
+              <w:t xml:space="preserve"> I had to confirm completion by checking the file and then close the listener with </w:t>
+            </w:r>
+            <w:proofErr w:type="spellStart"/>
+            <w:r>
+              <w:rPr>
+                <w:color w:val="1A1A1A"/>
+              </w:rPr>
+              <w:t>Ctrl+C</w:t>
+            </w:r>
+            <w:proofErr w:type="spellEnd"/>
+            <w:r>
+              <w:rPr>
+                <w:color w:val="1A1A1A"/>
+              </w:rPr>
+              <w:t>.</w:t>
             </w:r>
           </w:p>
         </w:tc>
@@ -1760,9 +2050,19 @@
           <w:color w:val="000000"/>
         </w:rPr>
         <w:lastRenderedPageBreak/>
-        <w:t>2. Two-Way Communication (Chat) with Netcat</w:t>
+        <w:t xml:space="preserve">2. Two-Way Communication (Chat) with </w:t>
+      </w:r>
+      <w:proofErr w:type="spellStart"/>
+      <w:r>
+        <w:rPr>
+          <w:b/>
+          <w:bCs/>
+          <w:color w:val="000000"/>
+        </w:rPr>
+        <w:t>Netcat</w:t>
       </w:r>
       <w:bookmarkEnd w:id="3"/>
+      <w:proofErr w:type="spellEnd"/>
     </w:p>
     <w:p>
       <w:pPr>
@@ -1774,7 +2074,25 @@
           <w:sz w:val="21"/>
           <w:szCs w:val="21"/>
         </w:rPr>
-        <w:t>Beyond files, a plain Netcat connection is just a raw TCP pipe, so typing text on either end sends it live to the other side. This practical set up a simple two-way chat between the Kali and Metasploitable2 VMs, with the listener role swapped to Kali this time.</w:t>
+        <w:t xml:space="preserve">Beyond files, a plain </w:t>
+      </w:r>
+      <w:proofErr w:type="spellStart"/>
+      <w:r>
+        <w:rPr>
+          <w:color w:val="262626"/>
+          <w:sz w:val="21"/>
+          <w:szCs w:val="21"/>
+        </w:rPr>
+        <w:t>Netcat</w:t>
+      </w:r>
+      <w:proofErr w:type="spellEnd"/>
+      <w:r>
+        <w:rPr>
+          <w:color w:val="262626"/>
+          <w:sz w:val="21"/>
+          <w:szCs w:val="21"/>
+        </w:rPr>
+        <w:t xml:space="preserve"> connection is just a raw TCP pipe, so typing text on either end sends it live to the other side. This practical set up a simple two-way chat between the Kali and Metasploitable2 VMs, with the listener role swapped to Kali this time.</w:t>
       </w:r>
     </w:p>
     <w:tbl>
@@ -1882,7 +2200,27 @@
                 <w:sz w:val="19"/>
                 <w:szCs w:val="19"/>
               </w:rPr>
-              <w:t>$ nc -n -lvp 4444</w:t>
+              <w:t>$ nc -n -</w:t>
+            </w:r>
+            <w:proofErr w:type="spellStart"/>
+            <w:r>
+              <w:rPr>
+                <w:rFonts w:ascii="Consolas" w:eastAsia="Consolas" w:hAnsi="Consolas" w:cs="Consolas"/>
+                <w:color w:val="E8E8E8"/>
+                <w:sz w:val="19"/>
+                <w:szCs w:val="19"/>
+              </w:rPr>
+              <w:t>lvp</w:t>
+            </w:r>
+            <w:proofErr w:type="spellEnd"/>
+            <w:r>
+              <w:rPr>
+                <w:rFonts w:ascii="Consolas" w:eastAsia="Consolas" w:hAnsi="Consolas" w:cs="Consolas"/>
+                <w:color w:val="E8E8E8"/>
+                <w:sz w:val="19"/>
+                <w:szCs w:val="19"/>
+              </w:rPr>
+              <w:t xml:space="preserve"> 4444</w:t>
             </w:r>
           </w:p>
           <w:p>
@@ -1949,7 +2287,43 @@
           <w:sz w:val="21"/>
           <w:szCs w:val="21"/>
         </w:rPr>
-        <w:t>Once the client connects, Netcat keeps the TCP connection open in the foreground on both ends, and stdin/stdout are simply piped across the socket</w:t>
+        <w:t xml:space="preserve">Once the client connects, </w:t>
+      </w:r>
+      <w:proofErr w:type="spellStart"/>
+      <w:r>
+        <w:rPr>
+          <w:color w:val="262626"/>
+          <w:sz w:val="21"/>
+          <w:szCs w:val="21"/>
+        </w:rPr>
+        <w:t>Netcat</w:t>
+      </w:r>
+      <w:proofErr w:type="spellEnd"/>
+      <w:r>
+        <w:rPr>
+          <w:color w:val="262626"/>
+          <w:sz w:val="21"/>
+          <w:szCs w:val="21"/>
+        </w:rPr>
+        <w:t xml:space="preserve"> keeps the TCP connection open in the foreground on both ends, and stdin/</w:t>
+      </w:r>
+      <w:proofErr w:type="spellStart"/>
+      <w:r>
+        <w:rPr>
+          <w:color w:val="262626"/>
+          <w:sz w:val="21"/>
+          <w:szCs w:val="21"/>
+        </w:rPr>
+        <w:t>stdout</w:t>
+      </w:r>
+      <w:proofErr w:type="spellEnd"/>
+      <w:r>
+        <w:rPr>
+          <w:color w:val="262626"/>
+          <w:sz w:val="21"/>
+          <w:szCs w:val="21"/>
+        </w:rPr>
+        <w:t xml:space="preserve"> are simply piped across the socket</w:t>
       </w:r>
       <w:r>
         <w:rPr>
@@ -1965,7 +2339,25 @@
           <w:sz w:val="21"/>
           <w:szCs w:val="21"/>
         </w:rPr>
-        <w:t>so a full-duplex chat happens as soon as both sides start typing, with no extra chat protocol involved. This time the -n flag was added on the listener side, which tells Netcat to skip DNS/reverse-DNS resolution entirely; because the earlier file-transfer practical logged a host-lookup failure for the same reason, adding -n here suppressed that message and connected slightly faster.</w:t>
+        <w:t xml:space="preserve">so a full-duplex chat happens as soon as both sides start typing, with no extra chat protocol involved. This time the -n flag was added on the listener side, which tells </w:t>
+      </w:r>
+      <w:proofErr w:type="spellStart"/>
+      <w:r>
+        <w:rPr>
+          <w:color w:val="262626"/>
+          <w:sz w:val="21"/>
+          <w:szCs w:val="21"/>
+        </w:rPr>
+        <w:t>Netcat</w:t>
+      </w:r>
+      <w:proofErr w:type="spellEnd"/>
+      <w:r>
+        <w:rPr>
+          <w:color w:val="262626"/>
+          <w:sz w:val="21"/>
+          <w:szCs w:val="21"/>
+        </w:rPr>
+        <w:t xml:space="preserve"> to skip DNS/reverse-DNS resolution entirely; because the earlier file-transfer practical logged a host-lookup failure for the same reason, adding -n here suppressed that message and connected slightly faster.</w:t>
       </w:r>
     </w:p>
     <w:p>
@@ -1978,7 +2370,25 @@
           <w:sz w:val="21"/>
           <w:szCs w:val="21"/>
         </w:rPr>
-        <w:t>The conversation shown below ("Hi / Hello / How are you doing? / I am good / Yourself? / I am doing amazing, thanks for asking.") appears identically on both terminals in real time, which is the clearest demonstration that Netcat is not doing anything file- or protocol-specific here</w:t>
+        <w:t xml:space="preserve">The conversation shown below ("Hi / Hello / How are you doing? / I am good / Yourself? / I am doing amazing, thanks for asking.") appears identically on both terminals in real time, which is the clearest demonstration that </w:t>
+      </w:r>
+      <w:proofErr w:type="spellStart"/>
+      <w:r>
+        <w:rPr>
+          <w:color w:val="262626"/>
+          <w:sz w:val="21"/>
+          <w:szCs w:val="21"/>
+        </w:rPr>
+        <w:t>Netcat</w:t>
+      </w:r>
+      <w:proofErr w:type="spellEnd"/>
+      <w:r>
+        <w:rPr>
+          <w:color w:val="262626"/>
+          <w:sz w:val="21"/>
+          <w:szCs w:val="21"/>
+        </w:rPr>
+        <w:t xml:space="preserve"> is not doing anything file- or protocol-specific here</w:t>
       </w:r>
       <w:r>
         <w:rPr>
@@ -2059,7 +2469,29 @@
           <w:sz w:val="18"/>
           <w:szCs w:val="18"/>
         </w:rPr>
-        <w:t>Figure 2 — A live two-way chat over a single Netcat TCP connection, shown mirrored on the Metasploitable2 (left) and Kali (right) terminals.</w:t>
+        <w:t xml:space="preserve">Figure 2 — A live two-way chat over a single </w:t>
+      </w:r>
+      <w:proofErr w:type="spellStart"/>
+      <w:r>
+        <w:rPr>
+          <w:i/>
+          <w:iCs/>
+          <w:color w:val="4D4D4D"/>
+          <w:sz w:val="18"/>
+          <w:szCs w:val="18"/>
+        </w:rPr>
+        <w:t>Netcat</w:t>
+      </w:r>
+      <w:proofErr w:type="spellEnd"/>
+      <w:r>
+        <w:rPr>
+          <w:i/>
+          <w:iCs/>
+          <w:color w:val="4D4D4D"/>
+          <w:sz w:val="18"/>
+          <w:szCs w:val="18"/>
+        </w:rPr>
+        <w:t xml:space="preserve"> TCP connection, shown mirrored on the Metasploitable2 (left) and Kali (right) terminals.</w:t>
       </w:r>
     </w:p>
     <w:tbl>
@@ -2229,7 +2661,25 @@
                 <w:sz w:val="19"/>
                 <w:szCs w:val="19"/>
               </w:rPr>
-              <w:t>nc -n -lvp 4444 (Kali)</w:t>
+              <w:t>nc -n -</w:t>
+            </w:r>
+            <w:proofErr w:type="spellStart"/>
+            <w:r>
+              <w:rPr>
+                <w:color w:val="262626"/>
+                <w:sz w:val="19"/>
+                <w:szCs w:val="19"/>
+              </w:rPr>
+              <w:t>lvp</w:t>
+            </w:r>
+            <w:proofErr w:type="spellEnd"/>
+            <w:r>
+              <w:rPr>
+                <w:color w:val="262626"/>
+                <w:sz w:val="19"/>
+                <w:szCs w:val="19"/>
+              </w:rPr>
+              <w:t xml:space="preserve"> 4444 (Kali)</w:t>
             </w:r>
           </w:p>
         </w:tc>
@@ -2348,6 +2798,7 @@
             <w:vAlign w:val="center"/>
           </w:tcPr>
           <w:p>
+            <w:proofErr w:type="spellStart"/>
             <w:r>
               <w:rPr>
                 <w:b/>
@@ -2358,6 +2809,7 @@
               </w:rPr>
               <w:t>Behaviour</w:t>
             </w:r>
+            <w:proofErr w:type="spellEnd"/>
           </w:p>
         </w:tc>
         <w:tc>
@@ -2464,6 +2916,7 @@
         <w:trPr>
           <w:gridAfter w:val="1"/>
           <w:wAfter w:w="9195" w:type="dxa"/>
+          <w:trHeight w:val="2079"/>
         </w:trPr>
         <w:tc>
           <w:tcPr>
@@ -2494,7 +2947,21 @@
               <w:rPr>
                 <w:color w:val="1A1A1A"/>
               </w:rPr>
-              <w:t>This practical made it click that a raw Netcat connection has no idea whether it's carrying a chat message, a file, or a shell command</w:t>
+              <w:t xml:space="preserve">This practical made it click that a raw </w:t>
+            </w:r>
+            <w:proofErr w:type="spellStart"/>
+            <w:r>
+              <w:rPr>
+                <w:color w:val="1A1A1A"/>
+              </w:rPr>
+              <w:t>Netcat</w:t>
+            </w:r>
+            <w:proofErr w:type="spellEnd"/>
+            <w:r>
+              <w:rPr>
+                <w:color w:val="1A1A1A"/>
+              </w:rPr>
+              <w:t xml:space="preserve"> connection has no idea whether it's carrying a chat message, a file, or a shell command</w:t>
             </w:r>
             <w:r>
               <w:rPr>
@@ -2558,13 +3025,41 @@
         </w:numPr>
         <w:spacing w:after="90"/>
       </w:pPr>
-      <w:r>
-        <w:rPr>
-          <w:color w:val="262626"/>
-          <w:sz w:val="21"/>
-          <w:szCs w:val="21"/>
-        </w:rPr>
-        <w:t>Netcat's core model is simple: one side listens with -l (optionally -v for verbose, -p &lt;port&gt; for the port), and the other side connects with a plain nc &lt;ip&gt; &lt;port&gt;.</w:t>
+      <w:proofErr w:type="spellStart"/>
+      <w:r>
+        <w:rPr>
+          <w:color w:val="262626"/>
+          <w:sz w:val="21"/>
+          <w:szCs w:val="21"/>
+        </w:rPr>
+        <w:t>Netcat's</w:t>
+      </w:r>
+      <w:proofErr w:type="spellEnd"/>
+      <w:r>
+        <w:rPr>
+          <w:color w:val="262626"/>
+          <w:sz w:val="21"/>
+          <w:szCs w:val="21"/>
+        </w:rPr>
+        <w:t xml:space="preserve"> core model is simple: one side listens with -l (optionally -v for verbose, -p &lt;port&gt; for the port), and the other side connects with a plain nc &lt;</w:t>
+      </w:r>
+      <w:proofErr w:type="spellStart"/>
+      <w:r>
+        <w:rPr>
+          <w:color w:val="262626"/>
+          <w:sz w:val="21"/>
+          <w:szCs w:val="21"/>
+        </w:rPr>
+        <w:t>ip</w:t>
+      </w:r>
+      <w:proofErr w:type="spellEnd"/>
+      <w:r>
+        <w:rPr>
+          <w:color w:val="262626"/>
+          <w:sz w:val="21"/>
+          <w:szCs w:val="21"/>
+        </w:rPr>
+        <w:t>&gt; &lt;port&gt;.</w:t>
       </w:r>
     </w:p>
     <w:p>
@@ -2582,7 +3077,25 @@
           <w:sz w:val="21"/>
           <w:szCs w:val="21"/>
         </w:rPr>
-        <w:t>Shell redirection (&gt; to write, &lt; to read) is what turns a raw Netcat pipe into a file-transfer tool</w:t>
+        <w:t xml:space="preserve">Shell redirection (&gt; to write, &lt; to read) is what turns a raw </w:t>
+      </w:r>
+      <w:proofErr w:type="spellStart"/>
+      <w:r>
+        <w:rPr>
+          <w:color w:val="262626"/>
+          <w:sz w:val="21"/>
+          <w:szCs w:val="21"/>
+        </w:rPr>
+        <w:t>Netcat</w:t>
+      </w:r>
+      <w:proofErr w:type="spellEnd"/>
+      <w:r>
+        <w:rPr>
+          <w:color w:val="262626"/>
+          <w:sz w:val="21"/>
+          <w:szCs w:val="21"/>
+        </w:rPr>
+        <w:t xml:space="preserve"> pipe into a file-transfer tool</w:t>
       </w:r>
       <w:r>
         <w:rPr>
@@ -2592,13 +3105,23 @@
         </w:rPr>
         <w:t xml:space="preserve">. </w:t>
       </w:r>
-      <w:r>
-        <w:rPr>
-          <w:color w:val="262626"/>
-          <w:sz w:val="21"/>
-          <w:szCs w:val="21"/>
-        </w:rPr>
-        <w:t>Netcat itself has no concept of "file"; it only moves bytes.</w:t>
+      <w:proofErr w:type="spellStart"/>
+      <w:r>
+        <w:rPr>
+          <w:color w:val="262626"/>
+          <w:sz w:val="21"/>
+          <w:szCs w:val="21"/>
+        </w:rPr>
+        <w:t>Netcat</w:t>
+      </w:r>
+      <w:proofErr w:type="spellEnd"/>
+      <w:r>
+        <w:rPr>
+          <w:color w:val="262626"/>
+          <w:sz w:val="21"/>
+          <w:szCs w:val="21"/>
+        </w:rPr>
+        <w:t xml:space="preserve"> itself has no concept of "file"; it only moves bytes.</w:t>
       </w:r>
     </w:p>
     <w:p>
@@ -2616,7 +3139,25 @@
           <w:sz w:val="21"/>
           <w:szCs w:val="21"/>
         </w:rPr>
-        <w:t>A live Netcat connection is inherently two-way (full-duplex): typing on either end sends data to the other immediately, which is the same mechanism a reverse or bind shell later relies on.</w:t>
+        <w:t xml:space="preserve">A live </w:t>
+      </w:r>
+      <w:proofErr w:type="spellStart"/>
+      <w:r>
+        <w:rPr>
+          <w:color w:val="262626"/>
+          <w:sz w:val="21"/>
+          <w:szCs w:val="21"/>
+        </w:rPr>
+        <w:t>Netcat</w:t>
+      </w:r>
+      <w:proofErr w:type="spellEnd"/>
+      <w:r>
+        <w:rPr>
+          <w:color w:val="262626"/>
+          <w:sz w:val="21"/>
+          <w:szCs w:val="21"/>
+        </w:rPr>
+        <w:t xml:space="preserve"> connection is inherently two-way (full-duplex): typing on either end sends data to the other immediately, which is the same mechanism a reverse or bind shell later relies on.</w:t>
       </w:r>
     </w:p>
     <w:p>
@@ -2660,7 +3201,25 @@
           <w:sz w:val="21"/>
           <w:szCs w:val="21"/>
         </w:rPr>
-        <w:t>Because Netcat performs no validation on filenames or input, small mistakes (like a mistyped output filename) fail silently rather than throwing an error — output should always be checked, not assumed.</w:t>
+        <w:t xml:space="preserve">Because </w:t>
+      </w:r>
+      <w:proofErr w:type="spellStart"/>
+      <w:r>
+        <w:rPr>
+          <w:color w:val="262626"/>
+          <w:sz w:val="21"/>
+          <w:szCs w:val="21"/>
+        </w:rPr>
+        <w:t>Netcat</w:t>
+      </w:r>
+      <w:proofErr w:type="spellEnd"/>
+      <w:r>
+        <w:rPr>
+          <w:color w:val="262626"/>
+          <w:sz w:val="21"/>
+          <w:szCs w:val="21"/>
+        </w:rPr>
+        <w:t xml:space="preserve"> performs no validation on filenames or input, small mistakes (like a mistyped output filename) fail silently rather than throwing an error — output should always be checked, not assumed.</w:t>
       </w:r>
     </w:p>
     <w:p>

</xml_diff>